<commit_message>
Add file:line refs to rabbit DOCX; fix RAG gaps for teo/125 and tonnage KPI
- DOCX themes now cite source paths with line ranges (файл:строка)
- Whitelist rabbit recipe files in is_trade_stat_file (125-табл-141)
- KPI fast path for «сколько тонн» + hybrid mode with block match
- Rebuilt vector index (747 chunks); tests 121/121

Co-authored-by: Demid369 <Demid369@users.noreply.github.com>
</commit_message>
<xml_diff>
--- a/docs/inventory/krolikovodstvo/docx/00-index-krolikovodstvo.docx
+++ b/docs/inventory/krolikovodstvo/docx/00-index-krolikovodstvo.docx
@@ -40,7 +40,7 @@
         <w:pStyle w:val="Heading1"/>
       </w:pPr>
       <w:r>
-        <w:t>Канонические KPI блока</w:t>
+        <w:t>Канонические KPI — ссылки на строки</w:t>
       </w:r>
     </w:p>
     <w:tbl>
@@ -50,13 +50,14 @@
         <w:tblLook w:firstColumn="1" w:firstRow="1" w:lastColumn="0" w:lastRow="0" w:noHBand="0" w:noVBand="1" w:val="04A0"/>
       </w:tblPr>
       <w:tblGrid>
-        <w:gridCol w:w="4320"/>
-        <w:gridCol w:w="4320"/>
+        <w:gridCol w:w="2880"/>
+        <w:gridCol w:w="2880"/>
+        <w:gridCol w:w="2880"/>
       </w:tblGrid>
       <w:tr>
         <w:tc>
           <w:tcPr>
-            <w:tcW w:type="dxa" w:w="4320"/>
+            <w:tcW w:type="dxa" w:w="2880"/>
           </w:tcPr>
           <w:p>
             <w:r>
@@ -66,7 +67,7 @@
         </w:tc>
         <w:tc>
           <w:tcPr>
-            <w:tcW w:type="dxa" w:w="4320"/>
+            <w:tcW w:type="dxa" w:w="2880"/>
           </w:tcPr>
           <w:p>
             <w:r>
@@ -74,11 +75,21 @@
             </w:r>
           </w:p>
         </w:tc>
+        <w:tc>
+          <w:tcPr>
+            <w:tcW w:type="dxa" w:w="2880"/>
+          </w:tcPr>
+          <w:p>
+            <w:r>
+              <w:t>Источник (файл:строка)</w:t>
+            </w:r>
+          </w:p>
+        </w:tc>
       </w:tr>
       <w:tr>
         <w:tc>
           <w:tcPr>
-            <w:tcW w:type="dxa" w:w="4320"/>
+            <w:tcW w:type="dxa" w:w="2880"/>
           </w:tcPr>
           <w:p>
             <w:r>
@@ -88,7 +99,7 @@
         </w:tc>
         <w:tc>
           <w:tcPr>
-            <w:tcW w:type="dxa" w:w="4320"/>
+            <w:tcW w:type="dxa" w:w="2880"/>
           </w:tcPr>
           <w:p>
             <w:r>
@@ -96,25 +107,13 @@
             </w:r>
           </w:p>
         </w:tc>
-      </w:tr>
-      <w:tr>
         <w:tc>
           <w:tcPr>
-            <w:tcW w:type="dxa" w:w="4320"/>
+            <w:tcW w:type="dxa" w:w="2880"/>
           </w:tcPr>
           <w:p>
             <w:r>
-              <w:t>heads_million</w:t>
-            </w:r>
-          </w:p>
-        </w:tc>
-        <w:tc>
-          <w:tcPr>
-            <w:tcW w:type="dxa" w:w="4320"/>
-          </w:tcPr>
-          <w:p>
-            <w:r>
-              <w:t>6</w:t>
+              <w:t>docs/graphify-corpus/00-summary.md:14</w:t>
             </w:r>
           </w:p>
         </w:tc>
@@ -122,51 +121,7 @@
       <w:tr>
         <w:tc>
           <w:tcPr>
-            <w:tcW w:type="dxa" w:w="4320"/>
-          </w:tcPr>
-          <w:p>
-            <w:r>
-              <w:t>workshops_total</w:t>
-            </w:r>
-          </w:p>
-        </w:tc>
-        <w:tc>
-          <w:tcPr>
-            <w:tcW w:type="dxa" w:w="4320"/>
-          </w:tcPr>
-          <w:p>
-            <w:r>
-              <w:t>81</w:t>
-            </w:r>
-          </w:p>
-        </w:tc>
-      </w:tr>
-      <w:tr>
-        <w:tc>
-          <w:tcPr>
-            <w:tcW w:type="dxa" w:w="4320"/>
-          </w:tcPr>
-          <w:p>
-            <w:r>
-              <w:t>workshops_rabbit</w:t>
-            </w:r>
-          </w:p>
-        </w:tc>
-        <w:tc>
-          <w:tcPr>
-            <w:tcW w:type="dxa" w:w="4320"/>
-          </w:tcPr>
-          <w:p>
-            <w:r>
-              <w:t>69</w:t>
-            </w:r>
-          </w:p>
-        </w:tc>
-      </w:tr>
-      <w:tr>
-        <w:tc>
-          <w:tcPr>
-            <w:tcW w:type="dxa" w:w="4320"/>
+            <w:tcW w:type="dxa" w:w="2880"/>
           </w:tcPr>
           <w:p>
             <w:r>
@@ -176,7 +131,7 @@
         </w:tc>
         <w:tc>
           <w:tcPr>
-            <w:tcW w:type="dxa" w:w="4320"/>
+            <w:tcW w:type="dxa" w:w="2880"/>
           </w:tcPr>
           <w:p>
             <w:r>
@@ -184,11 +139,21 @@
             </w:r>
           </w:p>
         </w:tc>
+        <w:tc>
+          <w:tcPr>
+            <w:tcW w:type="dxa" w:w="2880"/>
+          </w:tcPr>
+          <w:p>
+            <w:r>
+              <w:t>docs/graphify-corpus/00-summary.md:27</w:t>
+            </w:r>
+          </w:p>
+        </w:tc>
       </w:tr>
       <w:tr>
         <w:tc>
           <w:tcPr>
-            <w:tcW w:type="dxa" w:w="4320"/>
+            <w:tcW w:type="dxa" w:w="2880"/>
           </w:tcPr>
           <w:p>
             <w:r>
@@ -198,7 +163,7 @@
         </w:tc>
         <w:tc>
           <w:tcPr>
-            <w:tcW w:type="dxa" w:w="4320"/>
+            <w:tcW w:type="dxa" w:w="2880"/>
           </w:tcPr>
           <w:p>
             <w:r>
@@ -206,11 +171,21 @@
             </w:r>
           </w:p>
         </w:tc>
+        <w:tc>
+          <w:tcPr>
+            <w:tcW w:type="dxa" w:w="2880"/>
+          </w:tcPr>
+          <w:p>
+            <w:r>
+              <w:t>docs/graphify-corpus/00-summary.md:35</w:t>
+            </w:r>
+          </w:p>
+        </w:tc>
       </w:tr>
       <w:tr>
         <w:tc>
           <w:tcPr>
-            <w:tcW w:type="dxa" w:w="4320"/>
+            <w:tcW w:type="dxa" w:w="2880"/>
           </w:tcPr>
           <w:p>
             <w:r>
@@ -220,7 +195,7 @@
         </w:tc>
         <w:tc>
           <w:tcPr>
-            <w:tcW w:type="dxa" w:w="4320"/>
+            <w:tcW w:type="dxa" w:w="2880"/>
           </w:tcPr>
           <w:p>
             <w:r>
@@ -228,11 +203,21 @@
             </w:r>
           </w:p>
         </w:tc>
+        <w:tc>
+          <w:tcPr>
+            <w:tcW w:type="dxa" w:w="2880"/>
+          </w:tcPr>
+          <w:p>
+            <w:r>
+              <w:t>docs/graphify-corpus/00-summary.md:35</w:t>
+            </w:r>
+          </w:p>
+        </w:tc>
       </w:tr>
       <w:tr>
         <w:tc>
           <w:tcPr>
-            <w:tcW w:type="dxa" w:w="4320"/>
+            <w:tcW w:type="dxa" w:w="2880"/>
           </w:tcPr>
           <w:p>
             <w:r>
@@ -242,7 +227,7 @@
         </w:tc>
         <w:tc>
           <w:tcPr>
-            <w:tcW w:type="dxa" w:w="4320"/>
+            <w:tcW w:type="dxa" w:w="2880"/>
           </w:tcPr>
           <w:p>
             <w:r>
@@ -250,25 +235,13 @@
             </w:r>
           </w:p>
         </w:tc>
-      </w:tr>
-      <w:tr>
         <w:tc>
           <w:tcPr>
-            <w:tcW w:type="dxa" w:w="4320"/>
+            <w:tcW w:type="dxa" w:w="2880"/>
           </w:tcPr>
           <w:p>
             <w:r>
-              <w:t>price_rub_per_kg</w:t>
-            </w:r>
-          </w:p>
-        </w:tc>
-        <w:tc>
-          <w:tcPr>
-            <w:tcW w:type="dxa" w:w="4320"/>
-          </w:tcPr>
-          <w:p>
-            <w:r>
-              <w:t>560</w:t>
+              <w:t>docs/graphify-corpus/00-summary.md:35</w:t>
             </w:r>
           </w:p>
         </w:tc>
@@ -276,7 +249,71 @@
       <w:tr>
         <w:tc>
           <w:tcPr>
-            <w:tcW w:type="dxa" w:w="4320"/>
+            <w:tcW w:type="dxa" w:w="2880"/>
+          </w:tcPr>
+          <w:p>
+            <w:r>
+              <w:t>equipment</w:t>
+            </w:r>
+          </w:p>
+        </w:tc>
+        <w:tc>
+          <w:tcPr>
+            <w:tcW w:type="dxa" w:w="2880"/>
+          </w:tcPr>
+          <w:p>
+            <w:r>
+              <w:t>Meneghin Srl</w:t>
+            </w:r>
+          </w:p>
+        </w:tc>
+        <w:tc>
+          <w:tcPr>
+            <w:tcW w:type="dxa" w:w="2880"/>
+          </w:tcPr>
+          <w:p>
+            <w:r>
+              <w:t>docs/graphify-corpus/01-vvedenie-i-resume.md:722</w:t>
+            </w:r>
+          </w:p>
+        </w:tc>
+      </w:tr>
+      <w:tr>
+        <w:tc>
+          <w:tcPr>
+            <w:tcW w:type="dxa" w:w="2880"/>
+          </w:tcPr>
+          <w:p>
+            <w:r>
+              <w:t>slaughter_heads_per_hour</w:t>
+            </w:r>
+          </w:p>
+        </w:tc>
+        <w:tc>
+          <w:tcPr>
+            <w:tcW w:type="dxa" w:w="2880"/>
+          </w:tcPr>
+          <w:p>
+            <w:r>
+              <w:t>2400</w:t>
+            </w:r>
+          </w:p>
+        </w:tc>
+        <w:tc>
+          <w:tcPr>
+            <w:tcW w:type="dxa" w:w="2880"/>
+          </w:tcPr>
+          <w:p>
+            <w:r>
+              <w:t>docs/graphify-corpus/01-vvedenie-i-resume.md:404</w:t>
+            </w:r>
+          </w:p>
+        </w:tc>
+      </w:tr>
+      <w:tr>
+        <w:tc>
+          <w:tcPr>
+            <w:tcW w:type="dxa" w:w="2880"/>
           </w:tcPr>
           <w:p>
             <w:r>
@@ -286,7 +323,7 @@
         </w:tc>
         <w:tc>
           <w:tcPr>
-            <w:tcW w:type="dxa" w:w="4320"/>
+            <w:tcW w:type="dxa" w:w="2880"/>
           </w:tcPr>
           <w:p>
             <w:r>
@@ -294,25 +331,13 @@
             </w:r>
           </w:p>
         </w:tc>
-      </w:tr>
-      <w:tr>
         <w:tc>
           <w:tcPr>
-            <w:tcW w:type="dxa" w:w="4320"/>
+            <w:tcW w:type="dxa" w:w="2880"/>
           </w:tcPr>
           <w:p>
             <w:r>
-              <w:t>slaughter_heads_per_hour</w:t>
-            </w:r>
-          </w:p>
-        </w:tc>
-        <w:tc>
-          <w:tcPr>
-            <w:tcW w:type="dxa" w:w="4320"/>
-          </w:tcPr>
-          <w:p>
-            <w:r>
-              <w:t>2400</w:t>
+              <w:t>docs/graphify-corpus/01-vvedenie-i-resume.md:395</w:t>
             </w:r>
           </w:p>
         </w:tc>
@@ -320,95 +345,7 @@
       <w:tr>
         <w:tc>
           <w:tcPr>
-            <w:tcW w:type="dxa" w:w="4320"/>
-          </w:tcPr>
-          <w:p>
-            <w:r>
-              <w:t>solar_mwh</w:t>
-            </w:r>
-          </w:p>
-        </w:tc>
-        <w:tc>
-          <w:tcPr>
-            <w:tcW w:type="dxa" w:w="4320"/>
-          </w:tcPr>
-          <w:p>
-            <w:r>
-              <w:t>10</w:t>
-            </w:r>
-          </w:p>
-        </w:tc>
-      </w:tr>
-      <w:tr>
-        <w:tc>
-          <w:tcPr>
-            <w:tcW w:type="dxa" w:w="4320"/>
-          </w:tcPr>
-          <w:p>
-            <w:r>
-              <w:t>equipment</w:t>
-            </w:r>
-          </w:p>
-        </w:tc>
-        <w:tc>
-          <w:tcPr>
-            <w:tcW w:type="dxa" w:w="4320"/>
-          </w:tcPr>
-          <w:p>
-            <w:r>
-              <w:t>Meneghin Srl</w:t>
-            </w:r>
-          </w:p>
-        </w:tc>
-      </w:tr>
-      <w:tr>
-        <w:tc>
-          <w:tcPr>
-            <w:tcW w:type="dxa" w:w="4320"/>
-          </w:tcPr>
-          <w:p>
-            <w:r>
-              <w:t>slaughter_vendor</w:t>
-            </w:r>
-          </w:p>
-        </w:tc>
-        <w:tc>
-          <w:tcPr>
-            <w:tcW w:type="dxa" w:w="4320"/>
-          </w:tcPr>
-          <w:p>
-            <w:r>
-              <w:t>SINT Technologies</w:t>
-            </w:r>
-          </w:p>
-        </w:tc>
-      </w:tr>
-      <w:tr>
-        <w:tc>
-          <w:tcPr>
-            <w:tcW w:type="dxa" w:w="4320"/>
-          </w:tcPr>
-          <w:p>
-            <w:r>
-              <w:t>feed_vendor</w:t>
-            </w:r>
-          </w:p>
-        </w:tc>
-        <w:tc>
-          <w:tcPr>
-            <w:tcW w:type="dxa" w:w="4320"/>
-          </w:tcPr>
-          <w:p>
-            <w:r>
-              <w:t>F.lli FRAGOLA S.p.a.</w:t>
-            </w:r>
-          </w:p>
-        </w:tc>
-      </w:tr>
-      <w:tr>
-        <w:tc>
-          <w:tcPr>
-            <w:tcW w:type="dxa" w:w="4320"/>
+            <w:tcW w:type="dxa" w:w="2880"/>
           </w:tcPr>
           <w:p>
             <w:r>
@@ -418,7 +355,7 @@
         </w:tc>
         <w:tc>
           <w:tcPr>
-            <w:tcW w:type="dxa" w:w="4320"/>
+            <w:tcW w:type="dxa" w:w="2880"/>
           </w:tcPr>
           <w:p>
             <w:r>
@@ -426,25 +363,13 @@
             </w:r>
           </w:p>
         </w:tc>
-      </w:tr>
-      <w:tr>
         <w:tc>
           <w:tcPr>
-            <w:tcW w:type="dxa" w:w="4320"/>
+            <w:tcW w:type="dxa" w:w="2880"/>
           </w:tcPr>
           <w:p>
             <w:r>
-              <w:t>byproducts</w:t>
-            </w:r>
-          </w:p>
-        </w:tc>
-        <w:tc>
-          <w:tcPr>
-            <w:tcW w:type="dxa" w:w="4320"/>
-          </w:tcPr>
-          <w:p>
-            <w:r>
-              <w:t>['мех', 'шкурка', 'навоз']</w:t>
+              <w:t>docs/graphify-corpus/01-vvedenie-i-resume.md:379</w:t>
             </w:r>
           </w:p>
         </w:tc>

</xml_diff>

<commit_message>
Add inventory audit, registry validation, CI, and RAG canonical layers
- Validate registry.yaml against baseline and duplicates_map consistency
- Generate docx-audit.json line coverage matrix on each build
- Add T13 theme, 00-replace-checklist.docx, and --skip-docx mode
- Mark teo chunks with canonical_layer metadata; deprioritize reference_only
- Whitelist project teo files from trade-stat filter (teo/27 indexed)
- Extend rag validation: 10 smoke queries, --strict, IRR fix
- Sync inventory queries to teo-queries.yaml via sync script
- Add GitHub Actions workflow for inventory and RAG checks
- Rebuild index: 748 chunks with BM25 eager build

Co-authored-by: Demid369 <Demid369@users.noreply.github.com>
</commit_message>
<xml_diff>
--- a/docs/inventory/krolikovodstvo/docx/00-index-krolikovodstvo.docx
+++ b/docs/inventory/krolikovodstvo/docx/00-index-krolikovodstvo.docx
@@ -482,6 +482,22 @@
     </w:p>
     <w:p>
       <w:pPr>
+        <w:pStyle w:val="ListBullet"/>
+      </w:pPr>
+      <w:r>
+        <w:t>T13 — Карта дублей teo → corpus: T13-duplicates.docx</w:t>
+      </w:r>
+    </w:p>
+    <w:p>
+      <w:pPr>
+        <w:pStyle w:val="ListBullet"/>
+      </w:pPr>
+      <w:r>
+        <w:t>00-replace-checklist.docx — только replace/adapt + rebuild (чеклист замены)</w:t>
+      </w:r>
+    </w:p>
+    <w:p>
+      <w:pPr>
         <w:pStyle w:val="Heading1"/>
       </w:pPr>
       <w:r>

</xml_diff>